<commit_message>
Adjust the last two Level 4 lines the checker rejected
</commit_message>
<xml_diff>
--- a/level4/curriculum/Level4_Lesson13.docx
+++ b/level4/curriculum/Level4_Lesson13.docx
@@ -4885,7 +4885,7 @@
                 <w:i w:val="0"/>
                 <w:sz w:val="23"/>
               </w:rPr>
-              <w:t xml:space="preserve"> read the script aloud with a volunteer (about 1:56), at a natural speed, two times. The script says </w:t>
+              <w:t xml:space="preserve"> read the script aloud with a volunteer (about 1:55), at a natural speed, two times. The script says </w:t>
             </w:r>
             <w:r>
               <w:rPr>
@@ -6546,7 +6546,7 @@
           <w:color w:val="1B6F7A"/>
           <w:sz w:val="30"/>
         </w:rPr>
-        <w:t>Listening script (not recorded yet; about 1:56 when recorded; the conversation plays once, so press play again for the second listen)</w:t>
+        <w:t>Listening script (not recorded yet; about 1:55 when recorded; the conversation plays once, so press play again for the second listen)</w:t>
       </w:r>
     </w:p>
     <w:tbl>
@@ -6826,7 +6826,7 @@
                 <w:i w:val="0"/>
                 <w:sz w:val="22"/>
               </w:rPr>
-              <w:t xml:space="preserve"> What is next for me? After I finish Level 5, I'm going to take a training class. I want a job at the front desk. My advice to you is simple. Come to class, and do not be afraid to make mistakes. Thank you for listening.</w:t>
+              <w:t xml:space="preserve"> What is next for me? Next, I'm going to take a training class. I want a job at the front desk. My advice to you is simple. Come to class, and do not be afraid to make mistakes. Thank you for listening.</w:t>
             </w:r>
           </w:p>
           <w:p>

</xml_diff>